<commit_message>
PS3 report: embed 8 figures + heading color cascade (turquoise sections, deeppink subsections)
Restructure report headings so big sections render turquoise (H1) and
subsections deeppink (H2), per the build-pdf/build-docx cascade. Embed all
eight analytical figures (white-background variants in figures-report/ for
the white report page). Rebuilt PDF (21 pp) + DOCX.
</commit_message>
<xml_diff>
--- a/ps3/CPH200C_PS3_report.docx
+++ b/ps3/CPH200C_PS3_report.docx
@@ -29,7 +29,7 @@
     <w:bookmarkStart w:id="9" w:name="abstract"/>
     <w:p>
       <w:pPr>
-        <w:pStyle w:val="Heading2"/>
+        <w:pStyle w:val="Heading1"/>
       </w:pPr>
       <w:r>
         <w:t xml:space="preserve">Abstract</w:t>
@@ -47,7 +47,7 @@
     <w:bookmarkStart w:id="10" w:name="introduction-and-framing"/>
     <w:p>
       <w:pPr>
-        <w:pStyle w:val="Heading2"/>
+        <w:pStyle w:val="Heading1"/>
       </w:pPr>
       <w:r>
         <w:t xml:space="preserve">1. Introduction and framing</w:t>
@@ -121,11 +121,56 @@
         <w:t xml:space="preserve">What none of them anticipated is the event that reset the board in January 2025: a Chinese open-weight model, DeepSeek R1, reached frontier quality at a fraction of the cost, while United States labs moved further toward closed models. Lee’s implementation thesis has largely held, but with a twist, and the gap between demonstrated capability and realized economic value has turned out to be the dominant story of the period.</w:t>
       </w:r>
     </w:p>
+    <w:tbl>
+      <w:tblPr>
+        <w:tblStyle w:val="FigureTable"/>
+        <w:tblW w:type="auto" w:w="0"/>
+        <w:jc w:val="center"/>
+        <w:tblLook w:firstRow="0" w:lastRow="0" w:firstColumn="0" w:lastColumn="0"/>
+      </w:tblPr>
+      <w:tblGrid>
+        <w:gridCol w:w="7920"/>
+      </w:tblGrid>
+      <w:tr>
+        <w:tc>
+          <w:tcPr/>
+          <w:p>
+            <w:pPr>
+              <w:pStyle w:val="Compact"/>
+              <w:jc w:val="center"/>
+            </w:pPr>
+            <w:r>
+              <w:t xml:space="preserve">Figure 1. The three governing systems at a glance.</w:t>
+            </w:r>
+          </w:p>
+        </w:tc>
+      </w:tr>
+    </w:tbl>
+    <w:p>
+      <w:pPr>
+        <w:pStyle w:val="ImageCaption"/>
+      </w:pPr>
+      <w:r>
+        <w:t xml:space="preserve">Figure 1. The three governing systems at a glance.</w:t>
+      </w:r>
+    </w:p>
+    <w:p>
+      <w:pPr>
+        <w:pStyle w:val="BodyText"/>
+      </w:pPr>
+      <w:r>
+        <w:rPr>
+          <w:i/>
+          <w:iCs/>
+        </w:rPr>
+        <w:t xml:space="preserve">Figure 1. The three governing systems at a glance.</w:t>
+      </w:r>
+    </w:p>
     <w:bookmarkEnd w:id="10"/>
     <w:bookmarkStart w:id="14" w:name="policy-and-regulation"/>
     <w:p>
       <w:pPr>
-        <w:pStyle w:val="Heading2"/>
+        <w:pStyle w:val="Heading1"/>
       </w:pPr>
       <w:r>
         <w:t xml:space="preserve">2. Policy and regulation</w:t>
@@ -134,7 +179,7 @@
     <w:bookmarkStart w:id="11" w:name="X814ab85a4cf718f39bb8ef8c262f985112e7706"/>
     <w:p>
       <w:pPr>
-        <w:pStyle w:val="Heading3"/>
+        <w:pStyle w:val="Heading2"/>
       </w:pPr>
       <w:r>
         <w:t xml:space="preserve">2.1 United States: executive whiplash and a state patchwork</w:t>
@@ -196,7 +241,7 @@
     <w:bookmarkStart w:id="12" w:name="europe-the-ai-act-and-its-2025-softening"/>
     <w:p>
       <w:pPr>
-        <w:pStyle w:val="Heading3"/>
+        <w:pStyle w:val="Heading2"/>
       </w:pPr>
       <w:r>
         <w:t xml:space="preserve">2.2 Europe: the AI Act, and its 2025 softening</w:t>
@@ -234,7 +279,7 @@
     <w:bookmarkStart w:id="13" w:name="X77f5fb00c3610dea3abfc75ee9edc1cea12273c"/>
     <w:p>
       <w:pPr>
-        <w:pStyle w:val="Heading3"/>
+        <w:pStyle w:val="Heading2"/>
       </w:pPr>
       <w:r>
         <w:t xml:space="preserve">2.3 Asia: one region, the full regulatory spectrum</w:t>
@@ -253,7 +298,7 @@
     <w:bookmarkStart w:id="15" w:name="funding-and-capital"/>
     <w:p>
       <w:pPr>
-        <w:pStyle w:val="Heading2"/>
+        <w:pStyle w:val="Heading1"/>
       </w:pPr>
       <w:r>
         <w:t xml:space="preserve">3. Funding and capital</w:t>
@@ -265,6 +310,51 @@
       </w:pPr>
       <w:r>
         <w:t xml:space="preserve">The United States dominates AI capital to a degree that structures the entire field. By the Stanford AI Index, United States private AI investment in 2025 was roughly 285.9 billion dollars against China’s 12.4 billion, a gap of about 23 times, and the United States captured on the order of 83 percent of global private AI investment (Stanford HAI 2025; IEEE Spectrum 2026). Within the United States, AI startups absorbed about 222 billion dollars, roughly 65 percent of all United States venture capital (PitchBook 2026). Mega-rounds defined the year: OpenAI raised at a 300-billion-dollar valuation and later higher, Anthropic’s valuation climbed toward the high hundreds of billions, and xAI raised at 200 billion or more (Visual Capitalist 2025). These valuations are press-reported and should be read as directional.</w:t>
+      </w:r>
+    </w:p>
+    <w:tbl>
+      <w:tblPr>
+        <w:tblStyle w:val="FigureTable"/>
+        <w:tblW w:type="auto" w:w="0"/>
+        <w:jc w:val="center"/>
+        <w:tblLook w:firstRow="0" w:lastRow="0" w:firstColumn="0" w:lastColumn="0"/>
+      </w:tblPr>
+      <w:tblGrid>
+        <w:gridCol w:w="7920"/>
+      </w:tblGrid>
+      <w:tr>
+        <w:tc>
+          <w:tcPr/>
+          <w:p>
+            <w:pPr>
+              <w:pStyle w:val="Compact"/>
+              <w:jc w:val="center"/>
+            </w:pPr>
+            <w:r>
+              <w:t xml:space="preserve">Figure 2. Private AI investment, 2025: the United States captured roughly 83 percent of the global total (Stanford AI Index).</w:t>
+            </w:r>
+          </w:p>
+        </w:tc>
+      </w:tr>
+    </w:tbl>
+    <w:p>
+      <w:pPr>
+        <w:pStyle w:val="ImageCaption"/>
+      </w:pPr>
+      <w:r>
+        <w:t xml:space="preserve">Figure 2. Private AI investment, 2025: the United States captured roughly 83 percent of the global total (Stanford AI Index).</w:t>
+      </w:r>
+    </w:p>
+    <w:p>
+      <w:pPr>
+        <w:pStyle w:val="BodyText"/>
+      </w:pPr>
+      <w:r>
+        <w:rPr>
+          <w:i/>
+          <w:iCs/>
+        </w:rPr>
+        <w:t xml:space="preserve">Figure 2. Private AI investment, 2025: the United States captured roughly 83 percent of the global total (Stanford AI Index).</w:t>
       </w:r>
     </w:p>
     <w:p>
@@ -295,7 +385,7 @@
     <w:bookmarkStart w:id="20" w:name="technical-developments"/>
     <w:p>
       <w:pPr>
-        <w:pStyle w:val="Heading2"/>
+        <w:pStyle w:val="Heading1"/>
       </w:pPr>
       <w:r>
         <w:t xml:space="preserve">4. Technical developments</w:t>
@@ -304,7 +394,7 @@
     <w:bookmarkStart w:id="16" w:name="X73cd9b9f6261b21d3b20c1b41465445bb029806"/>
     <w:p>
       <w:pPr>
-        <w:pStyle w:val="Heading3"/>
+        <w:pStyle w:val="Heading2"/>
       </w:pPr>
       <w:r>
         <w:t xml:space="preserve">4.1 The chip war and the constraint it imposes</w:t>
@@ -328,13 +418,58 @@
       </w:r>
       <w:r>
         <w:t xml:space="preserve">a three-tier country framework, was rescinded in May 2025, two days before it took effect; by January 2026 the H200 and comparable parts were moved to case-by-case licensing under a 25 percent tariff, a 50 percent volume cap, and United States testing requirements (BIS 2025; Introl 2026). The NVIDIA H20 saga captured the volatility: an effective April 2025 ban triggered a multi-billion-dollar charge, after which sales resumed in July under a reported, and never formally finalized, arrangement giving the United States government 15 percent of NVIDIA’s China revenue, even as China discouraged purchases and banned a workaround consumer card during Jensen Huang’s May 2026 visit (Tom’s Hardware 2025; PBS 2025).</w:t>
+      </w:r>
+    </w:p>
+    <w:tbl>
+      <w:tblPr>
+        <w:tblStyle w:val="FigureTable"/>
+        <w:tblW w:type="auto" w:w="0"/>
+        <w:jc w:val="center"/>
+        <w:tblLook w:firstRow="0" w:lastRow="0" w:firstColumn="0" w:lastColumn="0"/>
+      </w:tblPr>
+      <w:tblGrid>
+        <w:gridCol w:w="7920"/>
+      </w:tblGrid>
+      <w:tr>
+        <w:tc>
+          <w:tcPr/>
+          <w:p>
+            <w:pPr>
+              <w:pStyle w:val="Compact"/>
+              <w:jc w:val="center"/>
+            </w:pPr>
+            <w:r>
+              <w:t xml:space="preserve">Figure 3. United States chip-export controls, 2022 to 2026: escalation, an abrupt 2025 reversal, and China’s pivot to domestic silicon.</w:t>
+            </w:r>
+          </w:p>
+        </w:tc>
+      </w:tr>
+    </w:tbl>
+    <w:p>
+      <w:pPr>
+        <w:pStyle w:val="ImageCaption"/>
+      </w:pPr>
+      <w:r>
+        <w:t xml:space="preserve">Figure 3. United States chip-export controls, 2022 to 2026: escalation, an abrupt 2025 reversal, and China’s pivot to domestic silicon.</w:t>
+      </w:r>
+    </w:p>
+    <w:p>
+      <w:pPr>
+        <w:pStyle w:val="BodyText"/>
+      </w:pPr>
+      <w:r>
+        <w:rPr>
+          <w:i/>
+          <w:iCs/>
+        </w:rPr>
+        <w:t xml:space="preserve">Figure 3. United States chip-export controls, 2022 to 2026: escalation, an abrupt 2025 reversal, and China’s pivot to domestic silicon.</w:t>
       </w:r>
     </w:p>
     <w:bookmarkEnd w:id="16"/>
     <w:bookmarkStart w:id="17" w:name="Xc6dda26c0e794e6fe3993a3723fe8113dd971e9"/>
     <w:p>
       <w:pPr>
-        <w:pStyle w:val="Heading3"/>
+        <w:pStyle w:val="Heading2"/>
       </w:pPr>
       <w:r>
         <w:t xml:space="preserve">4.2 Two paths to better models: scale versus constraint</w:t>
@@ -352,7 +487,7 @@
     <w:bookmarkStart w:id="18" w:name="the-open-weight-surge"/>
     <w:p>
       <w:pPr>
-        <w:pStyle w:val="Heading3"/>
+        <w:pStyle w:val="Heading2"/>
       </w:pPr>
       <w:r>
         <w:t xml:space="preserve">4.3 The open-weight surge</w:t>
@@ -376,13 +511,58 @@
       </w:r>
       <w:r>
         <w:t xml:space="preserve">a point developed in Section 7.</w:t>
+      </w:r>
+    </w:p>
+    <w:tbl>
+      <w:tblPr>
+        <w:tblStyle w:val="FigureTable"/>
+        <w:tblW w:type="auto" w:w="0"/>
+        <w:jc w:val="center"/>
+        <w:tblLook w:firstRow="0" w:lastRow="0" w:firstColumn="0" w:lastColumn="0"/>
+      </w:tblPr>
+      <w:tblGrid>
+        <w:gridCol w:w="7920"/>
+      </w:tblGrid>
+      <w:tr>
+        <w:tc>
+          <w:tcPr/>
+          <w:p>
+            <w:pPr>
+              <w:pStyle w:val="Compact"/>
+              <w:jc w:val="center"/>
+            </w:pPr>
+            <w:r>
+              <w:t xml:space="preserve">Figure 4. China’s open-weight surge: from about 1 percent to over 40 percent of usage on a major model router within a year.</w:t>
+            </w:r>
+          </w:p>
+        </w:tc>
+      </w:tr>
+    </w:tbl>
+    <w:p>
+      <w:pPr>
+        <w:pStyle w:val="ImageCaption"/>
+      </w:pPr>
+      <w:r>
+        <w:t xml:space="preserve">Figure 4. China’s open-weight surge: from about 1 percent to over 40 percent of usage on a major model router within a year.</w:t>
+      </w:r>
+    </w:p>
+    <w:p>
+      <w:pPr>
+        <w:pStyle w:val="BodyText"/>
+      </w:pPr>
+      <w:r>
+        <w:rPr>
+          <w:i/>
+          <w:iCs/>
+        </w:rPr>
+        <w:t xml:space="preserve">Figure 4. China’s open-weight surge: from about 1 percent to over 40 percent of usage on a major model router within a year.</w:t>
       </w:r>
     </w:p>
     <w:bookmarkEnd w:id="18"/>
     <w:bookmarkStart w:id="19" w:name="asia-owns-the-hardware"/>
     <w:p>
       <w:pPr>
-        <w:pStyle w:val="Heading3"/>
+        <w:pStyle w:val="Heading2"/>
       </w:pPr>
       <w:r>
         <w:t xml:space="preserve">4.4 Asia owns the hardware</w:t>
@@ -401,7 +581,7 @@
     <w:bookmarkStart w:id="21" w:name="deployment-and-adoption-landscape"/>
     <w:p>
       <w:pPr>
-        <w:pStyle w:val="Heading2"/>
+        <w:pStyle w:val="Heading1"/>
       </w:pPr>
       <w:r>
         <w:t xml:space="preserve">5. Deployment and adoption landscape</w:t>
@@ -413,6 +593,51 @@
       </w:pPr>
       <w:r>
         <w:t xml:space="preserve">Capability and capital are not the same as realized value, and the 2025 evidence makes the distinction stark. McKinsey’s late-2025 survey found that 88 percent of organizations use AI in at least one function, but only about a third have scaled it and only 39 percent report any earnings impact; the survey put Greater China (56 percent) and North America (57 percent) at near-parity on overall use (McKinsey 2025). Europe lags structurally: Eurostat reported that only 20 percent of EU enterprises used AI in 2025 (Eurostat 2025). The methodologies differ (Eurostat measures formal adoption, McKinsey is a broad survey), but the direction is consistent.</w:t>
+      </w:r>
+    </w:p>
+    <w:tbl>
+      <w:tblPr>
+        <w:tblStyle w:val="FigureTable"/>
+        <w:tblW w:type="auto" w:w="0"/>
+        <w:jc w:val="center"/>
+        <w:tblLook w:firstRow="0" w:lastRow="0" w:firstColumn="0" w:lastColumn="0"/>
+      </w:tblPr>
+      <w:tblGrid>
+        <w:gridCol w:w="7920"/>
+      </w:tblGrid>
+      <w:tr>
+        <w:tc>
+          <w:tcPr/>
+          <w:p>
+            <w:pPr>
+              <w:pStyle w:val="Compact"/>
+              <w:jc w:val="center"/>
+            </w:pPr>
+            <w:r>
+              <w:t xml:space="preserve">Figure 5. Enterprise AI use by region. Eurostat (formal adoption) and McKinsey (broad survey) use different definitions; the direction is consistent.</w:t>
+            </w:r>
+          </w:p>
+        </w:tc>
+      </w:tr>
+    </w:tbl>
+    <w:p>
+      <w:pPr>
+        <w:pStyle w:val="ImageCaption"/>
+      </w:pPr>
+      <w:r>
+        <w:t xml:space="preserve">Figure 5. Enterprise AI use by region. Eurostat (formal adoption) and McKinsey (broad survey) use different definitions; the direction is consistent.</w:t>
+      </w:r>
+    </w:p>
+    <w:p>
+      <w:pPr>
+        <w:pStyle w:val="BodyText"/>
+      </w:pPr>
+      <w:r>
+        <w:rPr>
+          <w:i/>
+          <w:iCs/>
+        </w:rPr>
+        <w:t xml:space="preserve">Figure 5. Enterprise AI use by region. Eurostat (formal adoption) and McKinsey (broad survey) use different definitions; the direction is consistent.</w:t>
       </w:r>
     </w:p>
     <w:p>
@@ -435,7 +660,7 @@
     <w:bookmarkStart w:id="25" w:name="the-clinical-ai-thread"/>
     <w:p>
       <w:pPr>
-        <w:pStyle w:val="Heading2"/>
+        <w:pStyle w:val="Heading1"/>
       </w:pPr>
       <w:r>
         <w:t xml:space="preserve">6. The clinical-AI thread</w:t>
@@ -447,12 +672,57 @@
       </w:pPr>
       <w:r>
         <w:t xml:space="preserve">Deployed clinical AI is the best single test of the three governing systems, both because it has the richest peer-reviewed evidence base and because the three systems diverge most sharply there. Most deployed clinical AI today is, in fact, radiology: imaging dominates the regulated landscape in every region.</w:t>
+      </w:r>
+    </w:p>
+    <w:tbl>
+      <w:tblPr>
+        <w:tblStyle w:val="FigureTable"/>
+        <w:tblW w:type="auto" w:w="0"/>
+        <w:jc w:val="center"/>
+        <w:tblLook w:firstRow="0" w:lastRow="0" w:firstColumn="0" w:lastColumn="0"/>
+      </w:tblPr>
+      <w:tblGrid>
+        <w:gridCol w:w="7920"/>
+      </w:tblGrid>
+      <w:tr>
+        <w:tc>
+          <w:tcPr/>
+          <w:p>
+            <w:pPr>
+              <w:pStyle w:val="Compact"/>
+              <w:jc w:val="center"/>
+            </w:pPr>
+            <w:r>
+              <w:t xml:space="preserve">Figure 6. How clinical AI reaches patients: three regulatory pathways.</w:t>
+            </w:r>
+          </w:p>
+        </w:tc>
+      </w:tr>
+    </w:tbl>
+    <w:p>
+      <w:pPr>
+        <w:pStyle w:val="ImageCaption"/>
+      </w:pPr>
+      <w:r>
+        <w:t xml:space="preserve">Figure 6. How clinical AI reaches patients: three regulatory pathways.</w:t>
+      </w:r>
+    </w:p>
+    <w:p>
+      <w:pPr>
+        <w:pStyle w:val="BodyText"/>
+      </w:pPr>
+      <w:r>
+        <w:rPr>
+          <w:i/>
+          <w:iCs/>
+        </w:rPr>
+        <w:t xml:space="preserve">Figure 6. How clinical AI reaches patients: three regulatory pathways.</w:t>
       </w:r>
     </w:p>
     <w:bookmarkStart w:id="22" w:name="regulation-by-region"/>
     <w:p>
       <w:pPr>
-        <w:pStyle w:val="Heading3"/>
+        <w:pStyle w:val="Heading2"/>
       </w:pPr>
       <w:r>
         <w:t xml:space="preserve">6.1 Regulation by region</w:t>
@@ -480,13 +750,58 @@
       </w:pPr>
       <w:r>
         <w:t xml:space="preserve">China deploys at a scale neither matches. Its National Medical Products Administration had approved 154 AI medical devices by mid-2025, roughly 80 percent of them the higher-risk Class III with mandatory trials, at a compound annual growth rate near 50 percent (JMIR 2026). More striking is deployment: roughly 261 hospitals locally deployed DeepSeek-R1 in the first quarter of 2025, mostly tertiary centers, and Ant Group’s AQ application links more than 5,000 hospitals, about a million doctors, and over 100 million users (Nature Medicine 2025; Baidu Baike 2026). South Korea has become a clinical-AI exporter (Lunit and VUNO, with FDA clearances and roughly a million mammograms per year), and India runs population-scale screening through Qure.ai’s national tuberculosis program (Seoul Economic Daily 2026; Tracxn 2026).</w:t>
+      </w:r>
+    </w:p>
+    <w:tbl>
+      <w:tblPr>
+        <w:tblStyle w:val="FigureTable"/>
+        <w:tblW w:type="auto" w:w="0"/>
+        <w:jc w:val="center"/>
+        <w:tblLook w:firstRow="0" w:lastRow="0" w:firstColumn="0" w:lastColumn="0"/>
+      </w:tblPr>
+      <w:tblGrid>
+        <w:gridCol w:w="7920"/>
+      </w:tblGrid>
+      <w:tr>
+        <w:tc>
+          <w:tcPr/>
+          <w:p>
+            <w:pPr>
+              <w:pStyle w:val="Compact"/>
+              <w:jc w:val="center"/>
+            </w:pPr>
+            <w:r>
+              <w:t xml:space="preserve">Figure 7. Cumulative AI medical-device approvals (FDA vs NMPA) and the contrast in deployment scale.</w:t>
+            </w:r>
+          </w:p>
+        </w:tc>
+      </w:tr>
+    </w:tbl>
+    <w:p>
+      <w:pPr>
+        <w:pStyle w:val="ImageCaption"/>
+      </w:pPr>
+      <w:r>
+        <w:t xml:space="preserve">Figure 7. Cumulative AI medical-device approvals (FDA vs NMPA) and the contrast in deployment scale.</w:t>
+      </w:r>
+    </w:p>
+    <w:p>
+      <w:pPr>
+        <w:pStyle w:val="BodyText"/>
+      </w:pPr>
+      <w:r>
+        <w:rPr>
+          <w:i/>
+          <w:iCs/>
+        </w:rPr>
+        <w:t xml:space="preserve">Figure 7. Cumulative AI medical-device approvals (FDA vs NMPA) and the contrast in deployment scale.</w:t>
       </w:r>
     </w:p>
     <w:bookmarkEnd w:id="22"/>
     <w:bookmarkStart w:id="23" w:name="Xb3428a0b62061b0cde99bd79f0386de6a6ad876"/>
     <w:p>
       <w:pPr>
-        <w:pStyle w:val="Heading3"/>
+        <w:pStyle w:val="Heading2"/>
       </w:pPr>
       <w:r>
         <w:t xml:space="preserve">6.2 The human factor and the measurement problem</w:t>
@@ -506,13 +821,58 @@
       </w:pPr>
       <w:r>
         <w:t xml:space="preserve">Second, the field is getting good at measuring what models can say, not whether they help patients. New physician-built benchmarks (HealthBench, with rubrics from 262 doctors; HealthAdminBench, for healthcare-administration agents) grade clinical capability against expert opinion (Arora et al. 2025; Bedi et al. 2026). But the broader scoping review of randomized controlled trials evaluating AI in clinical practice finds the trial evidence still thin and early-stage (Han et al. 2024). Most deployed clinical AI is validated against expert labels rather than patient outcomes, and high agreement with a clinician is not the same as being right about the patient. AI is even used against patients: insurers deploy it to deny coverage (Mello and Rose 2024).</w:t>
+      </w:r>
+    </w:p>
+    <w:tbl>
+      <w:tblPr>
+        <w:tblStyle w:val="FigureTable"/>
+        <w:tblW w:type="auto" w:w="0"/>
+        <w:jc w:val="center"/>
+        <w:tblLook w:firstRow="0" w:lastRow="0" w:firstColumn="0" w:lastColumn="0"/>
+      </w:tblPr>
+      <w:tblGrid>
+        <w:gridCol w:w="7920"/>
+      </w:tblGrid>
+      <w:tr>
+        <w:tc>
+          <w:tcPr/>
+          <w:p>
+            <w:pPr>
+              <w:pStyle w:val="Compact"/>
+              <w:jc w:val="center"/>
+            </w:pPr>
+            <w:r>
+              <w:t xml:space="preserve">Figure 8. The validation gap: most deployed clinical AI is graded against expert labels, not patient outcomes.</w:t>
+            </w:r>
+          </w:p>
+        </w:tc>
+      </w:tr>
+    </w:tbl>
+    <w:p>
+      <w:pPr>
+        <w:pStyle w:val="ImageCaption"/>
+      </w:pPr>
+      <w:r>
+        <w:t xml:space="preserve">Figure 8. The validation gap: most deployed clinical AI is graded against expert labels, not patient outcomes.</w:t>
+      </w:r>
+    </w:p>
+    <w:p>
+      <w:pPr>
+        <w:pStyle w:val="BodyText"/>
+      </w:pPr>
+      <w:r>
+        <w:rPr>
+          <w:i/>
+          <w:iCs/>
+        </w:rPr>
+        <w:t xml:space="preserve">Figure 8. The validation gap: most deployed clinical AI is graded against expert labels, not patient outcomes.</w:t>
       </w:r>
     </w:p>
     <w:bookmarkEnd w:id="23"/>
     <w:bookmarkStart w:id="24" w:name="the-clinical-synthesis"/>
     <w:p>
       <w:pPr>
-        <w:pStyle w:val="Heading3"/>
+        <w:pStyle w:val="Heading2"/>
       </w:pPr>
       <w:r>
         <w:t xml:space="preserve">6.3 The clinical synthesis</w:t>
@@ -531,7 +891,7 @@
     <w:bookmarkStart w:id="26" w:name="beyond-the-big-three"/>
     <w:p>
       <w:pPr>
-        <w:pStyle w:val="Heading2"/>
+        <w:pStyle w:val="Heading1"/>
       </w:pPr>
       <w:r>
         <w:t xml:space="preserve">7. Beyond the big three</w:t>
@@ -549,7 +909,7 @@
     <w:bookmarkStart w:id="27" w:name="synthesis-and-outlook"/>
     <w:p>
       <w:pPr>
-        <w:pStyle w:val="Heading2"/>
+        <w:pStyle w:val="Heading1"/>
       </w:pPr>
       <w:r>
         <w:t xml:space="preserve">8. Synthesis and outlook</w:t>
@@ -575,7 +935,7 @@
     <w:bookmarkStart w:id="28" w:name="caveats"/>
     <w:p>
       <w:pPr>
-        <w:pStyle w:val="Heading2"/>
+        <w:pStyle w:val="Heading1"/>
       </w:pPr>
       <w:r>
         <w:t xml:space="preserve">Caveats</w:t>
@@ -593,7 +953,7 @@
     <w:bookmarkStart w:id="29" w:name="references"/>
     <w:p>
       <w:pPr>
-        <w:pStyle w:val="Heading2"/>
+        <w:pStyle w:val="Heading1"/>
       </w:pPr>
       <w:r>
         <w:t xml:space="preserve">References</w:t>

</xml_diff>

<commit_message>
PS3: add "same scale, different layer of the stack" framing (Curtis) to full deck + report
New health-thread slide in the reference deck (now 40 slides) and report §6.2:
both the US and China deploy clinical LLMs at massive scale but in different
layers — China inside the diagnostic core (diagnostic reasoning + EHR;
DeepSeek-R1 / 261 hospitals, Ant AQ), the US around it (ambient scribes, coding,
prior auth; off the diagnostic decision, no FDA generative pathway). Europe is
the only fully autonomous diagnosis, but pragmatic: Oxipit ChestLink auto-clears
only NORMAL chest X-rays (~15-40% no finding) and routes positives to a human.
Kept out of the 10-min talk per Curtis's scoping.
</commit_message>
<xml_diff>
--- a/ps3/CPH200C_PS3_report.docx
+++ b/ps3/CPH200C_PS3_report.docx
@@ -44,7 +44,7 @@
       </w:r>
     </w:p>
     <w:bookmarkEnd w:id="9"/>
-    <w:bookmarkStart w:id="10" w:name="introduction-and-framing"/>
+    <w:bookmarkStart w:id="13" w:name="introduction-and-framing"/>
     <w:p>
       <w:pPr>
         <w:pStyle w:val="Heading1"/>
@@ -121,31 +121,53 @@
         <w:t xml:space="preserve">What none of them anticipated is the event that reset the board in January 2025: a Chinese open-weight model, DeepSeek R1, reached frontier quality at a fraction of the cost, while United States labs moved further toward closed models. Lee’s implementation thesis has largely held, but with a twist, and the gap between demonstrated capability and realized economic value has turned out to be the dominant story of the period.</w:t>
       </w:r>
     </w:p>
-    <w:tbl>
-      <w:tblPr>
-        <w:tblStyle w:val="FigureTable"/>
-        <w:tblW w:type="auto" w:w="0"/>
-        <w:jc w:val="center"/>
-        <w:tblLook w:firstRow="0" w:lastRow="0" w:firstColumn="0" w:lastColumn="0"/>
-      </w:tblPr>
-      <w:tblGrid>
-        <w:gridCol w:w="7920"/>
-      </w:tblGrid>
-      <w:tr>
-        <w:tc>
-          <w:tcPr/>
-          <w:p>
-            <w:pPr>
-              <w:pStyle w:val="Compact"/>
-              <w:jc w:val="center"/>
-            </w:pPr>
-            <w:r>
-              <w:t xml:space="preserve">Figure 1. The three governing systems at a glance.</w:t>
-            </w:r>
-          </w:p>
-        </w:tc>
-      </w:tr>
-    </w:tbl>
+    <w:p>
+      <w:pPr>
+        <w:pStyle w:val="CaptionedFigure"/>
+      </w:pPr>
+      <w:r>
+        <w:drawing>
+          <wp:inline>
+            <wp:extent cx="5943600" cy="3082143"/>
+            <wp:effectExtent b="0" l="0" r="0" t="0"/>
+            <wp:docPr descr="Figure 1. The three governing systems at a glance." title="" id="11" name="Picture"/>
+            <a:graphic>
+              <a:graphicData uri="http://schemas.openxmlformats.org/drawingml/2006/picture">
+                <pic:pic>
+                  <pic:nvPicPr>
+                    <pic:cNvPr descr="figures-report/governance_models.png" id="12" name="Picture"/>
+                    <pic:cNvPicPr>
+                      <a:picLocks noChangeArrowheads="1" noChangeAspect="1"/>
+                    </pic:cNvPicPr>
+                  </pic:nvPicPr>
+                  <pic:blipFill>
+                    <a:blip r:embed="rId10"/>
+                    <a:stretch>
+                      <a:fillRect/>
+                    </a:stretch>
+                  </pic:blipFill>
+                  <pic:spPr bwMode="auto">
+                    <a:xfrm>
+                      <a:off x="0" y="0"/>
+                      <a:ext cx="5943600" cy="3082143"/>
+                    </a:xfrm>
+                    <a:prstGeom prst="rect">
+                      <a:avLst/>
+                    </a:prstGeom>
+                    <a:noFill/>
+                    <a:ln w="9525">
+                      <a:noFill/>
+                      <a:headEnd/>
+                      <a:tailEnd/>
+                    </a:ln>
+                  </pic:spPr>
+                </pic:pic>
+              </a:graphicData>
+            </a:graphic>
+          </wp:inline>
+        </w:drawing>
+      </w:r>
+    </w:p>
     <w:p>
       <w:pPr>
         <w:pStyle w:val="ImageCaption"/>
@@ -166,8 +188,8 @@
         <w:t xml:space="preserve">Figure 1. The three governing systems at a glance.</w:t>
       </w:r>
     </w:p>
-    <w:bookmarkEnd w:id="10"/>
-    <w:bookmarkStart w:id="14" w:name="policy-and-regulation"/>
+    <w:bookmarkEnd w:id="13"/>
+    <w:bookmarkStart w:id="17" w:name="policy-and-regulation"/>
     <w:p>
       <w:pPr>
         <w:pStyle w:val="Heading1"/>
@@ -176,7 +198,7 @@
         <w:t xml:space="preserve">2. Policy and regulation</w:t>
       </w:r>
     </w:p>
-    <w:bookmarkStart w:id="11" w:name="X814ab85a4cf718f39bb8ef8c262f985112e7706"/>
+    <w:bookmarkStart w:id="14" w:name="X814ab85a4cf718f39bb8ef8c262f985112e7706"/>
     <w:p>
       <w:pPr>
         <w:pStyle w:val="Heading2"/>
@@ -273,8 +295,8 @@
         <w:t xml:space="preserve">while explicitly prohibiting any mandatory licensing or pre-clearance (White House 2026c). Notably, it is voluntary, national-security-framed, and silent on healthcare, confirming that even the federal government’s only frontier-model touch is a light, security-oriented one rather than a regulatory or clinical pathway. The net posture is a light federal touch, a thickening state patchwork, and an unresolved fight over who governs AI.</w:t>
       </w:r>
     </w:p>
-    <w:bookmarkEnd w:id="11"/>
-    <w:bookmarkStart w:id="12" w:name="europe-the-ai-act-and-its-2025-softening"/>
+    <w:bookmarkEnd w:id="14"/>
+    <w:bookmarkStart w:id="15" w:name="europe-the-ai-act-and-its-2025-softening"/>
     <w:p>
       <w:pPr>
         <w:pStyle w:val="Heading2"/>
@@ -311,8 +333,8 @@
         <w:t xml:space="preserve">on November 19, 2025 that delayed the high-risk regime to December 2027 (standalone systems) and August 2028 (systems embedded in regulated products, including medical devices); the separate AI Liability Directive was scrapped entirely (White &amp; Case 2026; Corporate Europe Observatory 2026). Critics characterized the package as a rollback of digital rights. The underlying numbers explain the panic: only about 11 percent of EU firms use AI against a 75 percent target for 2030, roughly 73 percent of foundation models are United States-origin against 15 percent for China, and Europe holds only four of the world’s top fifty technology firms (Carnegie 2025).</w:t>
       </w:r>
     </w:p>
-    <w:bookmarkEnd w:id="12"/>
-    <w:bookmarkStart w:id="13" w:name="X77f5fb00c3610dea3abfc75ee9edc1cea12273c"/>
+    <w:bookmarkEnd w:id="15"/>
+    <w:bookmarkStart w:id="16" w:name="X77f5fb00c3610dea3abfc75ee9edc1cea12273c"/>
     <w:p>
       <w:pPr>
         <w:pStyle w:val="Heading2"/>
@@ -329,9 +351,9 @@
         <w:t xml:space="preserve">Asia is the third governing system, but it is the least monolithic. It spans the entire regulatory range. China governs through a stack of vertical, fast-iterating ministry rules rather than an omnibus statute: the 2023 Interim Measures require public generative services to file with regulators (748 services filed by December 2025), and since September 2025 all AI-generated content must carry visible and metadata labels (China-Briefing 2023; Loeb 2025). China explicitly removed a comprehensive AI law from its 2025 agenda in favor of pilots and standards, and went on the diplomatic offensive, proposing a World AI Cooperation Organization at the 2025 World AI Conference (East Asia Forum 2025; gov.cn 2025a). South Korea took the EU path, enacting an AI Basic Act effective January 2026 (the second comprehensive regime after the EU, though far lighter, with fines capped near 21,000 US dollars) (Cooley 2026). Japan went the opposite way with an innovation-first AI Promotion Act (2025) carrying no penalties (White &amp; Case 2025). India and Singapore are light-touch, India through governance guidelines rather than a standalone law, Singapore through a voluntary framework paired with its AI Verify testing toolkit (NeGD 2025; Cambridge 2025).</w:t>
       </w:r>
     </w:p>
-    <w:bookmarkEnd w:id="13"/>
-    <w:bookmarkEnd w:id="14"/>
-    <w:bookmarkStart w:id="15" w:name="funding-and-capital"/>
+    <w:bookmarkEnd w:id="16"/>
+    <w:bookmarkEnd w:id="17"/>
+    <w:bookmarkStart w:id="21" w:name="funding-and-capital"/>
     <w:p>
       <w:pPr>
         <w:pStyle w:val="Heading1"/>
@@ -348,31 +370,53 @@
         <w:t xml:space="preserve">The United States dominates AI capital to a degree that structures the entire field. By the Stanford AI Index, United States private AI investment in 2025 was roughly 285.9 billion dollars against China’s 12.4 billion, a gap of about 23 times, and the United States captured on the order of 83 percent of global private AI investment (Stanford HAI 2025; IEEE Spectrum 2026). Within the United States, AI startups absorbed about 222 billion dollars, roughly 65 percent of all United States venture capital (PitchBook 2026). Mega-rounds defined the year: OpenAI raised at a 300-billion-dollar valuation and later higher, Anthropic’s valuation climbed toward the high hundreds of billions, and xAI raised at 200 billion or more (Visual Capitalist 2025). These valuations are press-reported and should be read as directional.</w:t>
       </w:r>
     </w:p>
-    <w:tbl>
-      <w:tblPr>
-        <w:tblStyle w:val="FigureTable"/>
-        <w:tblW w:type="auto" w:w="0"/>
-        <w:jc w:val="center"/>
-        <w:tblLook w:firstRow="0" w:lastRow="0" w:firstColumn="0" w:lastColumn="0"/>
-      </w:tblPr>
-      <w:tblGrid>
-        <w:gridCol w:w="7920"/>
-      </w:tblGrid>
-      <w:tr>
-        <w:tc>
-          <w:tcPr/>
-          <w:p>
-            <w:pPr>
-              <w:pStyle w:val="Compact"/>
-              <w:jc w:val="center"/>
-            </w:pPr>
-            <w:r>
-              <w:t xml:space="preserve">Figure 2. Private AI investment, 2025: the United States captured roughly 83 percent of the global total (Stanford AI Index).</w:t>
-            </w:r>
-          </w:p>
-        </w:tc>
-      </w:tr>
-    </w:tbl>
+    <w:p>
+      <w:pPr>
+        <w:pStyle w:val="CaptionedFigure"/>
+      </w:pPr>
+      <w:r>
+        <w:drawing>
+          <wp:inline>
+            <wp:extent cx="5943600" cy="4095258"/>
+            <wp:effectExtent b="0" l="0" r="0" t="0"/>
+            <wp:docPr descr="Figure 2. Private AI investment, 2025: the United States captured roughly 83 percent of the global total (Stanford AI Index)." title="" id="19" name="Picture"/>
+            <a:graphic>
+              <a:graphicData uri="http://schemas.openxmlformats.org/drawingml/2006/picture">
+                <pic:pic>
+                  <pic:nvPicPr>
+                    <pic:cNvPr descr="figures-report/investment_gap.png" id="20" name="Picture"/>
+                    <pic:cNvPicPr>
+                      <a:picLocks noChangeArrowheads="1" noChangeAspect="1"/>
+                    </pic:cNvPicPr>
+                  </pic:nvPicPr>
+                  <pic:blipFill>
+                    <a:blip r:embed="rId18"/>
+                    <a:stretch>
+                      <a:fillRect/>
+                    </a:stretch>
+                  </pic:blipFill>
+                  <pic:spPr bwMode="auto">
+                    <a:xfrm>
+                      <a:off x="0" y="0"/>
+                      <a:ext cx="5943600" cy="4095258"/>
+                    </a:xfrm>
+                    <a:prstGeom prst="rect">
+                      <a:avLst/>
+                    </a:prstGeom>
+                    <a:noFill/>
+                    <a:ln w="9525">
+                      <a:noFill/>
+                      <a:headEnd/>
+                      <a:tailEnd/>
+                    </a:ln>
+                  </pic:spPr>
+                </pic:pic>
+              </a:graphicData>
+            </a:graphic>
+          </wp:inline>
+        </w:drawing>
+      </w:r>
+    </w:p>
     <w:p>
       <w:pPr>
         <w:pStyle w:val="ImageCaption"/>
@@ -417,8 +461,8 @@
         <w:t xml:space="preserve">Regulatory leniency and talent policy compound these differences. The United Kingdom is the most explicitly pro-innovation rules-based regime, with a financial-conduct sandbox and a stated tolerance for failure; the EU mandates regulatory sandboxes but has delayed them to 2027, with only about eight of 27 member states ready; China is permissive on deployment speed while strict on speech and data (FCA 2025; Orrick 2026). On talent, the two largest systems moved in opposite directions in the same year: the United States imposed a 100,000-dollar fee on each H-1B petition in September 2025, a measure widely described as a tax on startups given that roughly 60 percent of top United States AI startups had an immigrant founder, while China launched an uncapped, employer-sponsorship-free K-visa for STEM and AI talent in October 2025, timed to absorb the talent the United States was now pricing out (Bulletin of the Atomic Scientists 2025; C&amp;EN 2025).</w:t>
       </w:r>
     </w:p>
-    <w:bookmarkEnd w:id="15"/>
-    <w:bookmarkStart w:id="21" w:name="technical-developments"/>
+    <w:bookmarkEnd w:id="21"/>
+    <w:bookmarkStart w:id="33" w:name="technical-developments"/>
     <w:p>
       <w:pPr>
         <w:pStyle w:val="Heading1"/>
@@ -427,7 +471,7 @@
         <w:t xml:space="preserve">4. Technical developments</w:t>
       </w:r>
     </w:p>
-    <w:bookmarkStart w:id="16" w:name="X73cd9b9f6261b21d3b20c1b41465445bb029806"/>
+    <w:bookmarkStart w:id="25" w:name="X73cd9b9f6261b21d3b20c1b41465445bb029806"/>
     <w:p>
       <w:pPr>
         <w:pStyle w:val="Heading2"/>
@@ -456,31 +500,53 @@
         <w:t xml:space="preserve">a three-tier country framework, was rescinded in May 2025, two days before it took effect; by January 2026 the H200 and comparable parts were moved to case-by-case licensing under a 25 percent tariff, a 50 percent volume cap, and United States testing requirements (BIS 2025; Introl 2026). The NVIDIA H20 saga captured the volatility: an effective April 2025 ban triggered a multi-billion-dollar charge, after which sales resumed in July under a reported, and never formally finalized, arrangement giving the United States government 15 percent of NVIDIA’s China revenue, even as China discouraged purchases and banned a workaround consumer card during Jensen Huang’s May 2026 visit (Tom’s Hardware 2025; PBS 2025).</w:t>
       </w:r>
     </w:p>
-    <w:tbl>
-      <w:tblPr>
-        <w:tblStyle w:val="FigureTable"/>
-        <w:tblW w:type="auto" w:w="0"/>
-        <w:jc w:val="center"/>
-        <w:tblLook w:firstRow="0" w:lastRow="0" w:firstColumn="0" w:lastColumn="0"/>
-      </w:tblPr>
-      <w:tblGrid>
-        <w:gridCol w:w="7920"/>
-      </w:tblGrid>
-      <w:tr>
-        <w:tc>
-          <w:tcPr/>
-          <w:p>
-            <w:pPr>
-              <w:pStyle w:val="Compact"/>
-              <w:jc w:val="center"/>
-            </w:pPr>
-            <w:r>
-              <w:t xml:space="preserve">Figure 3. United States chip-export controls, 2022 to 2026: escalation, an abrupt 2025 reversal, and China’s pivot to domestic silicon.</w:t>
-            </w:r>
-          </w:p>
-        </w:tc>
-      </w:tr>
-    </w:tbl>
+    <w:p>
+      <w:pPr>
+        <w:pStyle w:val="CaptionedFigure"/>
+      </w:pPr>
+      <w:r>
+        <w:drawing>
+          <wp:inline>
+            <wp:extent cx="5943600" cy="2670000"/>
+            <wp:effectExtent b="0" l="0" r="0" t="0"/>
+            <wp:docPr descr="Figure 3. United States chip-export controls, 2022 to 2026: escalation, an abrupt 2025 reversal, and China’s pivot to domestic silicon." title="" id="23" name="Picture"/>
+            <a:graphic>
+              <a:graphicData uri="http://schemas.openxmlformats.org/drawingml/2006/picture">
+                <pic:pic>
+                  <pic:nvPicPr>
+                    <pic:cNvPr descr="figures-report/chip_war_timeline.png" id="24" name="Picture"/>
+                    <pic:cNvPicPr>
+                      <a:picLocks noChangeArrowheads="1" noChangeAspect="1"/>
+                    </pic:cNvPicPr>
+                  </pic:nvPicPr>
+                  <pic:blipFill>
+                    <a:blip r:embed="rId22"/>
+                    <a:stretch>
+                      <a:fillRect/>
+                    </a:stretch>
+                  </pic:blipFill>
+                  <pic:spPr bwMode="auto">
+                    <a:xfrm>
+                      <a:off x="0" y="0"/>
+                      <a:ext cx="5943600" cy="2670000"/>
+                    </a:xfrm>
+                    <a:prstGeom prst="rect">
+                      <a:avLst/>
+                    </a:prstGeom>
+                    <a:noFill/>
+                    <a:ln w="9525">
+                      <a:noFill/>
+                      <a:headEnd/>
+                      <a:tailEnd/>
+                    </a:ln>
+                  </pic:spPr>
+                </pic:pic>
+              </a:graphicData>
+            </a:graphic>
+          </wp:inline>
+        </w:drawing>
+      </w:r>
+    </w:p>
     <w:p>
       <w:pPr>
         <w:pStyle w:val="ImageCaption"/>
@@ -501,8 +567,8 @@
         <w:t xml:space="preserve">Figure 3. United States chip-export controls, 2022 to 2026: escalation, an abrupt 2025 reversal, and China’s pivot to domestic silicon.</w:t>
       </w:r>
     </w:p>
-    <w:bookmarkEnd w:id="16"/>
-    <w:bookmarkStart w:id="17" w:name="Xc6dda26c0e794e6fe3993a3723fe8113dd971e9"/>
+    <w:bookmarkEnd w:id="25"/>
+    <w:bookmarkStart w:id="26" w:name="Xc6dda26c0e794e6fe3993a3723fe8113dd971e9"/>
     <w:p>
       <w:pPr>
         <w:pStyle w:val="Heading2"/>
@@ -543,8 +609,8 @@
         <w:t xml:space="preserve">oriented around data throughput rather than transistor-size shrinkage to route around the lithography it cannot buy (Tom’s Hardware 2026; SCMP 2026). The specific architectural claim should be treated as unverified, the SCMP coverage itself asks whether it is a breakthrough or merely hype, but the posture is the substantive point: China now openly frames the controls as counterproductive. Europe’s technical leverage sits upstream of both: ASML’s near-monopoly on extreme-ultraviolet lithography is the chokepoint through which the controls themselves operate (ASML 2026).</w:t>
       </w:r>
     </w:p>
-    <w:bookmarkEnd w:id="17"/>
-    <w:bookmarkStart w:id="18" w:name="the-open-weight-surge"/>
+    <w:bookmarkEnd w:id="26"/>
+    <w:bookmarkStart w:id="30" w:name="the-open-weight-surge"/>
     <w:p>
       <w:pPr>
         <w:pStyle w:val="Heading2"/>
@@ -573,31 +639,53 @@
         <w:t xml:space="preserve">a point developed in Section 7.</w:t>
       </w:r>
     </w:p>
-    <w:tbl>
-      <w:tblPr>
-        <w:tblStyle w:val="FigureTable"/>
-        <w:tblW w:type="auto" w:w="0"/>
-        <w:jc w:val="center"/>
-        <w:tblLook w:firstRow="0" w:lastRow="0" w:firstColumn="0" w:lastColumn="0"/>
-      </w:tblPr>
-      <w:tblGrid>
-        <w:gridCol w:w="7920"/>
-      </w:tblGrid>
-      <w:tr>
-        <w:tc>
-          <w:tcPr/>
-          <w:p>
-            <w:pPr>
-              <w:pStyle w:val="Compact"/>
-              <w:jc w:val="center"/>
-            </w:pPr>
-            <w:r>
-              <w:t xml:space="preserve">Figure 4. China’s open-weight surge: from about 1 percent to over 40 percent of usage on a major model router within a year.</w:t>
-            </w:r>
-          </w:p>
-        </w:tc>
-      </w:tr>
-    </w:tbl>
+    <w:p>
+      <w:pPr>
+        <w:pStyle w:val="CaptionedFigure"/>
+      </w:pPr>
+      <w:r>
+        <w:drawing>
+          <wp:inline>
+            <wp:extent cx="5943600" cy="3489421"/>
+            <wp:effectExtent b="0" l="0" r="0" t="0"/>
+            <wp:docPr descr="Figure 4. China’s open-weight surge: from about 1 percent to over 40 percent of usage on a major model router within a year." title="" id="28" name="Picture"/>
+            <a:graphic>
+              <a:graphicData uri="http://schemas.openxmlformats.org/drawingml/2006/picture">
+                <pic:pic>
+                  <pic:nvPicPr>
+                    <pic:cNvPr descr="figures-report/open_weight_rise.png" id="29" name="Picture"/>
+                    <pic:cNvPicPr>
+                      <a:picLocks noChangeArrowheads="1" noChangeAspect="1"/>
+                    </pic:cNvPicPr>
+                  </pic:nvPicPr>
+                  <pic:blipFill>
+                    <a:blip r:embed="rId27"/>
+                    <a:stretch>
+                      <a:fillRect/>
+                    </a:stretch>
+                  </pic:blipFill>
+                  <pic:spPr bwMode="auto">
+                    <a:xfrm>
+                      <a:off x="0" y="0"/>
+                      <a:ext cx="5943600" cy="3489421"/>
+                    </a:xfrm>
+                    <a:prstGeom prst="rect">
+                      <a:avLst/>
+                    </a:prstGeom>
+                    <a:noFill/>
+                    <a:ln w="9525">
+                      <a:noFill/>
+                      <a:headEnd/>
+                      <a:tailEnd/>
+                    </a:ln>
+                  </pic:spPr>
+                </pic:pic>
+              </a:graphicData>
+            </a:graphic>
+          </wp:inline>
+        </w:drawing>
+      </w:r>
+    </w:p>
     <w:p>
       <w:pPr>
         <w:pStyle w:val="ImageCaption"/>
@@ -618,8 +706,8 @@
         <w:t xml:space="preserve">Figure 4. China’s open-weight surge: from about 1 percent to over 40 percent of usage on a major model router within a year.</w:t>
       </w:r>
     </w:p>
-    <w:bookmarkEnd w:id="18"/>
-    <w:bookmarkStart w:id="19" w:name="the-frontier-standing-who-actually-leads"/>
+    <w:bookmarkEnd w:id="30"/>
+    <w:bookmarkStart w:id="31" w:name="the-frontier-standing-who-actually-leads"/>
     <w:p>
       <w:pPr>
         <w:pStyle w:val="Heading2"/>
@@ -636,8 +724,8 @@
         <w:t xml:space="preserve">The open-weight surge should not be mistaken for parity at the frontier. Through 2026 the absolute capability frontier remains American: Anthropic’s Claude Opus 4.8, OpenAI’s GPT-5.5, and Google’s Gemini 3.1 sit at the top of public leaderboards, and the United States produced roughly 50 notable models in 2025 against China’s 30 (Stanford HAI 2026; Artificial Analysis 2026). China’s best open models stay remarkably close, within roughly 2.7 percent on the LMArena scale and on the order of a seven-month capability lag by Epoch AI’s tracking, and DeepSeek’s V4 release (April 2026) reached near-frontier quality at roughly a tenth of the cost of comparable United States models (Epoch AI 2026; DeepSeek-AI 2026). The accurate framing is therefore not that China has caught up but that it is a fast follower that wins on cost and openness while the proprietary frontier crown stays American, and by some measures the proprietary lead is widening even as the open-weight gap narrows. Europe is thin at this frontier: Mistral is its only serious contender, and DeepMind, though United Kingdom-founded, operates under United States (Google) ownership.</w:t>
       </w:r>
     </w:p>
-    <w:bookmarkEnd w:id="19"/>
-    <w:bookmarkStart w:id="20" w:name="asia-owns-the-hardware"/>
+    <w:bookmarkEnd w:id="31"/>
+    <w:bookmarkStart w:id="32" w:name="asia-owns-the-hardware"/>
     <w:p>
       <w:pPr>
         <w:pStyle w:val="Heading2"/>
@@ -654,9 +742,9 @@
         <w:t xml:space="preserve">Where Asia is genuinely unified and dominant is the physical supply chain. Taiwan’s TSMC fabricates essentially all leading-edge AI logic, and its advanced-packaging capacity (CoWoS), more than 60 percent of which NVIDIA has booked, is the true bottleneck (wccftech 2026). South Korea owns the memory: SK Hynix holds roughly 62 percent of high-bandwidth memory, is NVIDIA’s lead supplier, and is set to provide about two-thirds of HBM4 for NVIDIA’s next platform (CNBC 2026b; TrendForce 2026). Taiwan’s Foxconn assembles more than 40 percent of the world’s AI servers (Foxconn 2025). The Taiwan-Korea hardware spine is the region’s structural lock on the entire industry.</w:t>
       </w:r>
     </w:p>
-    <w:bookmarkEnd w:id="20"/>
-    <w:bookmarkEnd w:id="21"/>
-    <w:bookmarkStart w:id="22" w:name="deployment-and-adoption-landscape"/>
+    <w:bookmarkEnd w:id="32"/>
+    <w:bookmarkEnd w:id="33"/>
+    <w:bookmarkStart w:id="37" w:name="deployment-and-adoption-landscape"/>
     <w:p>
       <w:pPr>
         <w:pStyle w:val="Heading1"/>
@@ -673,31 +761,53 @@
         <w:t xml:space="preserve">Capability and capital are not the same as realized value, and the 2025 evidence makes the distinction stark. McKinsey’s late-2025 survey found that 88 percent of organizations use AI in at least one function, but only about a third have scaled it and only 39 percent report any earnings impact; the survey put Greater China (56 percent) and North America (57 percent) at near-parity on overall use (McKinsey 2025). Europe lags structurally: Eurostat reported that only 20 percent of EU enterprises used AI in 2025 (Eurostat 2025). The methodologies differ (Eurostat measures formal adoption, McKinsey is a broad survey), but the direction is consistent.</w:t>
       </w:r>
     </w:p>
-    <w:tbl>
-      <w:tblPr>
-        <w:tblStyle w:val="FigureTable"/>
-        <w:tblW w:type="auto" w:w="0"/>
-        <w:jc w:val="center"/>
-        <w:tblLook w:firstRow="0" w:lastRow="0" w:firstColumn="0" w:lastColumn="0"/>
-      </w:tblPr>
-      <w:tblGrid>
-        <w:gridCol w:w="7920"/>
-      </w:tblGrid>
-      <w:tr>
-        <w:tc>
-          <w:tcPr/>
-          <w:p>
-            <w:pPr>
-              <w:pStyle w:val="Compact"/>
-              <w:jc w:val="center"/>
-            </w:pPr>
-            <w:r>
-              <w:t xml:space="preserve">Figure 5. Enterprise AI use by region. Eurostat (formal adoption) and McKinsey (broad survey) use different definitions; the direction is consistent.</w:t>
-            </w:r>
-          </w:p>
-        </w:tc>
-      </w:tr>
-    </w:tbl>
+    <w:p>
+      <w:pPr>
+        <w:pStyle w:val="CaptionedFigure"/>
+      </w:pPr>
+      <w:r>
+        <w:drawing>
+          <wp:inline>
+            <wp:extent cx="5943600" cy="4079856"/>
+            <wp:effectExtent b="0" l="0" r="0" t="0"/>
+            <wp:docPr descr="Figure 5. Enterprise AI use by region. Eurostat (formal adoption) and McKinsey (broad survey) use different definitions; the direction is consistent." title="" id="35" name="Picture"/>
+            <a:graphic>
+              <a:graphicData uri="http://schemas.openxmlformats.org/drawingml/2006/picture">
+                <pic:pic>
+                  <pic:nvPicPr>
+                    <pic:cNvPr descr="figures-report/enterprise_adoption.png" id="36" name="Picture"/>
+                    <pic:cNvPicPr>
+                      <a:picLocks noChangeArrowheads="1" noChangeAspect="1"/>
+                    </pic:cNvPicPr>
+                  </pic:nvPicPr>
+                  <pic:blipFill>
+                    <a:blip r:embed="rId34"/>
+                    <a:stretch>
+                      <a:fillRect/>
+                    </a:stretch>
+                  </pic:blipFill>
+                  <pic:spPr bwMode="auto">
+                    <a:xfrm>
+                      <a:off x="0" y="0"/>
+                      <a:ext cx="5943600" cy="4079856"/>
+                    </a:xfrm>
+                    <a:prstGeom prst="rect">
+                      <a:avLst/>
+                    </a:prstGeom>
+                    <a:noFill/>
+                    <a:ln w="9525">
+                      <a:noFill/>
+                      <a:headEnd/>
+                      <a:tailEnd/>
+                    </a:ln>
+                  </pic:spPr>
+                </pic:pic>
+              </a:graphicData>
+            </a:graphic>
+          </wp:inline>
+        </w:drawing>
+      </w:r>
+    </w:p>
     <w:p>
       <w:pPr>
         <w:pStyle w:val="ImageCaption"/>
@@ -734,8 +844,8 @@
         <w:t xml:space="preserve">The headline of the period is the return-on-investment gap. MIT’s Project NANDA found that 95 percent of enterprise generative-AI pilots delivered no measurable profit-and-loss impact despite 30 to 40 billion dollars of spending, even as top-down estimates remained enormous (McKinsey’s 2.6 to 4.4 trillion dollars per year, Goldman’s roughly 7 percent of global GDP) (Fortune 2025). On the capability scoreboard the United States leads decisively, producing far more notable models than China or Europe and contributing the largest share of high-impact research and investment, while China leads on granted AI patents (Stanford HAI 2026). On government readiness, Oxford Insights ranked the United States first and China eighth in 2025, the latter up from twenty-third (Oxford Insights 2025).</w:t>
       </w:r>
     </w:p>
-    <w:bookmarkEnd w:id="22"/>
-    <w:bookmarkStart w:id="26" w:name="the-clinical-ai-thread"/>
+    <w:bookmarkEnd w:id="37"/>
+    <w:bookmarkStart w:id="51" w:name="the-clinical-ai-thread"/>
     <w:p>
       <w:pPr>
         <w:pStyle w:val="Heading1"/>
@@ -752,31 +862,53 @@
         <w:t xml:space="preserve">Deployed clinical AI is the best single test of the three governing systems, both because it has the richest peer-reviewed evidence base and because the three systems diverge most sharply there. Most deployed clinical AI today is, in fact, radiology: imaging dominates the regulated landscape in every region.</w:t>
       </w:r>
     </w:p>
-    <w:tbl>
-      <w:tblPr>
-        <w:tblStyle w:val="FigureTable"/>
-        <w:tblW w:type="auto" w:w="0"/>
-        <w:jc w:val="center"/>
-        <w:tblLook w:firstRow="0" w:lastRow="0" w:firstColumn="0" w:lastColumn="0"/>
-      </w:tblPr>
-      <w:tblGrid>
-        <w:gridCol w:w="7920"/>
-      </w:tblGrid>
-      <w:tr>
-        <w:tc>
-          <w:tcPr/>
-          <w:p>
-            <w:pPr>
-              <w:pStyle w:val="Compact"/>
-              <w:jc w:val="center"/>
-            </w:pPr>
-            <w:r>
-              <w:t xml:space="preserve">Figure 6. How clinical AI reaches patients: three regulatory pathways.</w:t>
-            </w:r>
-          </w:p>
-        </w:tc>
-      </w:tr>
-    </w:tbl>
+    <w:p>
+      <w:pPr>
+        <w:pStyle w:val="CaptionedFigure"/>
+      </w:pPr>
+      <w:r>
+        <w:drawing>
+          <wp:inline>
+            <wp:extent cx="5943600" cy="3075685"/>
+            <wp:effectExtent b="0" l="0" r="0" t="0"/>
+            <wp:docPr descr="Figure 6. How clinical AI reaches patients: three regulatory pathways." title="" id="39" name="Picture"/>
+            <a:graphic>
+              <a:graphicData uri="http://schemas.openxmlformats.org/drawingml/2006/picture">
+                <pic:pic>
+                  <pic:nvPicPr>
+                    <pic:cNvPr descr="figures-report/clinical_pathways.png" id="40" name="Picture"/>
+                    <pic:cNvPicPr>
+                      <a:picLocks noChangeArrowheads="1" noChangeAspect="1"/>
+                    </pic:cNvPicPr>
+                  </pic:nvPicPr>
+                  <pic:blipFill>
+                    <a:blip r:embed="rId38"/>
+                    <a:stretch>
+                      <a:fillRect/>
+                    </a:stretch>
+                  </pic:blipFill>
+                  <pic:spPr bwMode="auto">
+                    <a:xfrm>
+                      <a:off x="0" y="0"/>
+                      <a:ext cx="5943600" cy="3075685"/>
+                    </a:xfrm>
+                    <a:prstGeom prst="rect">
+                      <a:avLst/>
+                    </a:prstGeom>
+                    <a:noFill/>
+                    <a:ln w="9525">
+                      <a:noFill/>
+                      <a:headEnd/>
+                      <a:tailEnd/>
+                    </a:ln>
+                  </pic:spPr>
+                </pic:pic>
+              </a:graphicData>
+            </a:graphic>
+          </wp:inline>
+        </w:drawing>
+      </w:r>
+    </w:p>
     <w:p>
       <w:pPr>
         <w:pStyle w:val="ImageCaption"/>
@@ -797,7 +929,7 @@
         <w:t xml:space="preserve">Figure 6. How clinical AI reaches patients: three regulatory pathways.</w:t>
       </w:r>
     </w:p>
-    <w:bookmarkStart w:id="23" w:name="regulation-by-region"/>
+    <w:bookmarkStart w:id="44" w:name="regulation-by-region"/>
     <w:p>
       <w:pPr>
         <w:pStyle w:val="Heading2"/>
@@ -830,31 +962,53 @@
         <w:t xml:space="preserve">China deploys at a scale neither matches. Its National Medical Products Administration had approved 154 AI medical devices by mid-2025, roughly 80 percent of them the higher-risk Class III with mandatory trials, at a compound annual growth rate near 50 percent (JMIR 2026). More striking is deployment: roughly 261 hospitals locally deployed DeepSeek-R1 in the first quarter of 2025, mostly tertiary centers, and Ant Group’s AQ application links more than 5,000 hospitals, about a million doctors, and over 100 million users (Nature Medicine 2025; Baidu Baike 2026). South Korea has become a clinical-AI exporter (Lunit and VUNO, with FDA clearances and roughly a million mammograms per year), and India runs population-scale screening through Qure.ai’s national tuberculosis program (Seoul Economic Daily 2026; Tracxn 2026).</w:t>
       </w:r>
     </w:p>
-    <w:tbl>
-      <w:tblPr>
-        <w:tblStyle w:val="FigureTable"/>
-        <w:tblW w:type="auto" w:w="0"/>
-        <w:jc w:val="center"/>
-        <w:tblLook w:firstRow="0" w:lastRow="0" w:firstColumn="0" w:lastColumn="0"/>
-      </w:tblPr>
-      <w:tblGrid>
-        <w:gridCol w:w="7920"/>
-      </w:tblGrid>
-      <w:tr>
-        <w:tc>
-          <w:tcPr/>
-          <w:p>
-            <w:pPr>
-              <w:pStyle w:val="Compact"/>
-              <w:jc w:val="center"/>
-            </w:pPr>
-            <w:r>
-              <w:t xml:space="preserve">Figure 7. Cumulative AI medical-device approvals (FDA vs NMPA) and the contrast in deployment scale.</w:t>
-            </w:r>
-          </w:p>
-        </w:tc>
-      </w:tr>
-    </w:tbl>
+    <w:p>
+      <w:pPr>
+        <w:pStyle w:val="CaptionedFigure"/>
+      </w:pPr>
+      <w:r>
+        <w:drawing>
+          <wp:inline>
+            <wp:extent cx="5943600" cy="2997418"/>
+            <wp:effectExtent b="0" l="0" r="0" t="0"/>
+            <wp:docPr descr="Figure 7. Cumulative AI medical-device approvals (FDA vs NMPA) and the contrast in deployment scale." title="" id="42" name="Picture"/>
+            <a:graphic>
+              <a:graphicData uri="http://schemas.openxmlformats.org/drawingml/2006/picture">
+                <pic:pic>
+                  <pic:nvPicPr>
+                    <pic:cNvPr descr="figures-report/clinical_ai.png" id="43" name="Picture"/>
+                    <pic:cNvPicPr>
+                      <a:picLocks noChangeArrowheads="1" noChangeAspect="1"/>
+                    </pic:cNvPicPr>
+                  </pic:nvPicPr>
+                  <pic:blipFill>
+                    <a:blip r:embed="rId41"/>
+                    <a:stretch>
+                      <a:fillRect/>
+                    </a:stretch>
+                  </pic:blipFill>
+                  <pic:spPr bwMode="auto">
+                    <a:xfrm>
+                      <a:off x="0" y="0"/>
+                      <a:ext cx="5943600" cy="2997418"/>
+                    </a:xfrm>
+                    <a:prstGeom prst="rect">
+                      <a:avLst/>
+                    </a:prstGeom>
+                    <a:noFill/>
+                    <a:ln w="9525">
+                      <a:noFill/>
+                      <a:headEnd/>
+                      <a:tailEnd/>
+                    </a:ln>
+                  </pic:spPr>
+                </pic:pic>
+              </a:graphicData>
+            </a:graphic>
+          </wp:inline>
+        </w:drawing>
+      </w:r>
+    </w:p>
     <w:p>
       <w:pPr>
         <w:pStyle w:val="ImageCaption"/>
@@ -875,14 +1029,14 @@
         <w:t xml:space="preserve">Figure 7. Cumulative AI medical-device approvals (FDA vs NMPA) and the contrast in deployment scale.</w:t>
       </w:r>
     </w:p>
-    <w:bookmarkEnd w:id="23"/>
-    <w:bookmarkStart w:id="24" w:name="Xb3428a0b62061b0cde99bd79f0386de6a6ad876"/>
+    <w:bookmarkEnd w:id="44"/>
+    <w:bookmarkStart w:id="45" w:name="same-scale-different-layer-of-the-stack"/>
     <w:p>
       <w:pPr>
         <w:pStyle w:val="Heading2"/>
       </w:pPr>
       <w:r>
-        <w:t xml:space="preserve">6.2 The human factor and the measurement problem</w:t>
+        <w:t xml:space="preserve">6.2 Same scale, different layer of the stack</w:t>
       </w:r>
     </w:p>
     <w:p>
@@ -890,42 +1044,82 @@
         <w:pStyle w:val="FirstParagraph"/>
       </w:pPr>
       <w:r>
-        <w:t xml:space="preserve">Two findings cut against techno-optimism. First, the human-AI interaction, not raw model accuracy, decides clinical value. A randomized trial found that giving physicians a large language model did not significantly improve their diagnostic reasoning, even though the model alone scored well, because clinicians underused it (Goh et al. 2024). Over-reliance carries its own hazard: endoscopists in a 2025 study detected fewer adenomas after routine exposure to AI, an automation-bias and deskilling effect (Budzyn et al. 2025). Notably, this evidence is largely Western; China’s population-scale deployment has outpaced interaction research.</w:t>
+        <w:t xml:space="preserve">A sharper way to read the deployment difference is by where in the clinical stack each region has placed AI at scale. The United States and China have both put clinical large language models into production at massive scale, but in different layers. China deploys them inside the diagnostic core, directly into diagnostic reasoning and the electronic health record, with DeepSeek-R1 running across 261 hospitals and Ant Group’s AQ reaching over 100 million users and roughly 5,000 hospitals. The United States deploys them around the core, in the administrative and ambient layer: ambient scribes (Abridge, Nuance DAX), medical coding, prior authorization, and patient messaging, deliberately staying off the diagnostic decision because there is no FDA pathway for generative diagnosis. Europe occupies a third position: it is the only region to field fully autonomous diagnosis, but it does so pragmatically. Oxipit’s ChestLink auto-reports only the normal chest X-rays, the roughly 15 to 40 percent of studies with no finding, and routes every positive to a radiologist, clearing the easy volume while keeping a human on anything abnormal. Same scale, three different bets on where AI sits in the clinical workflow: the United States automates the paperwork around the clinician, China augments the diagnostic reasoning, and Europe removes the human only on the cases that are clearly negative.</w:t>
+      </w:r>
+    </w:p>
+    <w:bookmarkEnd w:id="45"/>
+    <w:bookmarkStart w:id="49" w:name="Xb3428a0b62061b0cde99bd79f0386de6a6ad876"/>
+    <w:p>
+      <w:pPr>
+        <w:pStyle w:val="Heading2"/>
+      </w:pPr>
+      <w:r>
+        <w:t xml:space="preserve">6.3 The human factor and the measurement problem</w:t>
       </w:r>
     </w:p>
     <w:p>
       <w:pPr>
+        <w:pStyle w:val="FirstParagraph"/>
+      </w:pPr>
+      <w:r>
+        <w:t xml:space="preserve">Two findings cut against techno-optimism. First, the human-AI interaction, not raw model accuracy, decides clinical value. A randomized trial found that giving physicians a large language model did not significantly improve their diagnostic reasoning, even though the model alone scored well, because clinicians underused it (Goh et al. 2024). Over-reliance carries its own hazard: endoscopists in a 2025 study detected fewer adenomas after routine exposure to AI, an automation-bias and deskilling effect (Budzyn et al. 2025). Notably, this evidence is largely Western; China’s population-scale deployment has outpaced interaction research.</w:t>
+      </w:r>
+    </w:p>
+    <w:p>
+      <w:pPr>
         <w:pStyle w:val="BodyText"/>
       </w:pPr>
       <w:r>
         <w:t xml:space="preserve">Second, the field is getting good at measuring what models can say, not whether they help patients. New physician-built benchmarks (HealthBench, with rubrics from 262 doctors; HealthAdminBench, for healthcare-administration agents) grade clinical capability against expert opinion (Arora et al. 2025; Bedi et al. 2026). But the broader scoping review of randomized controlled trials evaluating AI in clinical practice finds the trial evidence still thin and early-stage (Han et al. 2024). Most deployed clinical AI is validated against expert labels rather than patient outcomes, and high agreement with a clinician is not the same as being right about the patient. AI is even used against patients: insurers deploy it to deny coverage (Mello and Rose 2024).</w:t>
       </w:r>
     </w:p>
-    <w:tbl>
-      <w:tblPr>
-        <w:tblStyle w:val="FigureTable"/>
-        <w:tblW w:type="auto" w:w="0"/>
-        <w:jc w:val="center"/>
-        <w:tblLook w:firstRow="0" w:lastRow="0" w:firstColumn="0" w:lastColumn="0"/>
-      </w:tblPr>
-      <w:tblGrid>
-        <w:gridCol w:w="7920"/>
-      </w:tblGrid>
-      <w:tr>
-        <w:tc>
-          <w:tcPr/>
-          <w:p>
-            <w:pPr>
-              <w:pStyle w:val="Compact"/>
-              <w:jc w:val="center"/>
-            </w:pPr>
-            <w:r>
-              <w:t xml:space="preserve">Figure 8. The validation gap: most deployed clinical AI is graded against expert labels, not patient outcomes.</w:t>
-            </w:r>
-          </w:p>
-        </w:tc>
-      </w:tr>
-    </w:tbl>
+    <w:p>
+      <w:pPr>
+        <w:pStyle w:val="CaptionedFigure"/>
+      </w:pPr>
+      <w:r>
+        <w:drawing>
+          <wp:inline>
+            <wp:extent cx="5943600" cy="3839747"/>
+            <wp:effectExtent b="0" l="0" r="0" t="0"/>
+            <wp:docPr descr="Figure 8. The validation gap: most deployed clinical AI is graded against expert labels, not patient outcomes." title="" id="47" name="Picture"/>
+            <a:graphic>
+              <a:graphicData uri="http://schemas.openxmlformats.org/drawingml/2006/picture">
+                <pic:pic>
+                  <pic:nvPicPr>
+                    <pic:cNvPr descr="figures-report/validation_ladder.png" id="48" name="Picture"/>
+                    <pic:cNvPicPr>
+                      <a:picLocks noChangeArrowheads="1" noChangeAspect="1"/>
+                    </pic:cNvPicPr>
+                  </pic:nvPicPr>
+                  <pic:blipFill>
+                    <a:blip r:embed="rId46"/>
+                    <a:stretch>
+                      <a:fillRect/>
+                    </a:stretch>
+                  </pic:blipFill>
+                  <pic:spPr bwMode="auto">
+                    <a:xfrm>
+                      <a:off x="0" y="0"/>
+                      <a:ext cx="5943600" cy="3839747"/>
+                    </a:xfrm>
+                    <a:prstGeom prst="rect">
+                      <a:avLst/>
+                    </a:prstGeom>
+                    <a:noFill/>
+                    <a:ln w="9525">
+                      <a:noFill/>
+                      <a:headEnd/>
+                      <a:tailEnd/>
+                    </a:ln>
+                  </pic:spPr>
+                </pic:pic>
+              </a:graphicData>
+            </a:graphic>
+          </wp:inline>
+        </w:drawing>
+      </w:r>
+    </w:p>
     <w:p>
       <w:pPr>
         <w:pStyle w:val="ImageCaption"/>
@@ -946,14 +1140,14 @@
         <w:t xml:space="preserve">Figure 8. The validation gap: most deployed clinical AI is graded against expert labels, not patient outcomes.</w:t>
       </w:r>
     </w:p>
-    <w:bookmarkEnd w:id="24"/>
-    <w:bookmarkStart w:id="25" w:name="the-clinical-synthesis"/>
+    <w:bookmarkEnd w:id="49"/>
+    <w:bookmarkStart w:id="50" w:name="the-clinical-synthesis"/>
     <w:p>
       <w:pPr>
         <w:pStyle w:val="Heading2"/>
       </w:pPr>
       <w:r>
-        <w:t xml:space="preserve">6.3 The clinical synthesis</w:t>
+        <w:t xml:space="preserve">6.4 The clinical synthesis</w:t>
       </w:r>
     </w:p>
     <w:p>
@@ -964,9 +1158,9 @@
         <w:t xml:space="preserve">The same regulate, build, deploy split that defines AI broadly defines clinical AI specifically. The United States approves the most discrete tools but is reimbursement-starved and has no pathway for generative clinical AI. Europe is the most heavily regulated vertical. China deploys at population scale under lighter, state-coordinated oversight. The bottleneck on whether clinical AI reaches patients is institutional, regulation, payment, and coordination, more than it is a question of model quality.</w:t>
       </w:r>
     </w:p>
-    <w:bookmarkEnd w:id="25"/>
-    <w:bookmarkEnd w:id="26"/>
-    <w:bookmarkStart w:id="27" w:name="beyond-the-big-three"/>
+    <w:bookmarkEnd w:id="50"/>
+    <w:bookmarkEnd w:id="51"/>
+    <w:bookmarkStart w:id="52" w:name="beyond-the-big-three"/>
     <w:p>
       <w:pPr>
         <w:pStyle w:val="Heading1"/>
@@ -983,8 +1177,8 @@
         <w:t xml:space="preserve">Two further actors matter without rising to the level of a fourth hub. The Gulf states bring capital rather than models: Stargate UAE (5 gigawatts, led by G42 and MGX), Saudi Arabia’s HUMAIN, and MGX’s commitment of up to 500 billion dollars to United States Stargate represent abundant capital and compute atop thin domestic talent and markets (Middle East Institute 2025). The Global South is the deployment battleground, where United States and Chinese open models compete for the next billion users and where sovereign-language models (SEA-LION, Sahabat-AI, TAIDE) run on rented, increasingly Chinese, open weights. Singapore’s national program switching its base model from Meta’s Llama to Alibaba’s Qwen in November 2025 is the sharpest single illustration: a United States-aligned government building on a Chinese foundation (TechNode 2025).</w:t>
       </w:r>
     </w:p>
-    <w:bookmarkEnd w:id="27"/>
-    <w:bookmarkStart w:id="28" w:name="synthesis-and-outlook"/>
+    <w:bookmarkEnd w:id="52"/>
+    <w:bookmarkStart w:id="53" w:name="synthesis-and-outlook"/>
     <w:p>
       <w:pPr>
         <w:pStyle w:val="Heading1"/>
@@ -1009,8 +1203,8 @@
         <w:t xml:space="preserve">Three implications follow. First, the open-versus-closed split is the structural story, and China’s open weights are becoming global infrastructure, itself a geopolitical outcome. Second, each region’s binding constraint differs, and the interesting open question is whether the United States power constraint or the China chip constraint binds harder over the next two years. Third, in medicine the lesson is sharpest: the deployed-AI bottleneck is institutional, and the field should move its success metric from agreement with expert labels toward measured patient outcomes.</w:t>
       </w:r>
     </w:p>
-    <w:bookmarkEnd w:id="28"/>
-    <w:bookmarkStart w:id="29" w:name="caveats"/>
+    <w:bookmarkEnd w:id="53"/>
+    <w:bookmarkStart w:id="54" w:name="caveats"/>
     <w:p>
       <w:pPr>
         <w:pStyle w:val="Heading1"/>
@@ -1027,8 +1221,8 @@
         <w:t xml:space="preserve">Several figures are press-reported rather than company-confirmed, including the largest valuations (Anthropic, xAI, several Chinese labs) and the NVIDIA revenue-share and tariff terms, which are political understandings rather than signed contracts. China’s data-center and spare-power projections are analyst estimates. Adoption percentages mix methodologies (formal adoption versus broad survey) and should not be conflated. Open-weight usage and download metrics measure different things. The FDA cumulative device count varies by source and date. Named deployed traditional-Chinese-medicine diagnostic systems remain largely research-stage and were not firmly verified.</w:t>
       </w:r>
     </w:p>
-    <w:bookmarkEnd w:id="29"/>
-    <w:bookmarkStart w:id="30" w:name="references"/>
+    <w:bookmarkEnd w:id="54"/>
+    <w:bookmarkStart w:id="55" w:name="references"/>
     <w:p>
       <w:pPr>
         <w:pStyle w:val="Heading1"/>
@@ -2032,7 +2226,7 @@
         <w:t xml:space="preserve">“Three Governing Systems for Clinical AI.”</w:t>
       </w:r>
     </w:p>
-    <w:bookmarkEnd w:id="30"/>
+    <w:bookmarkEnd w:id="55"/>
     <w:sectPr>
       <w:pgSz w:h="15840" w:w="12240"/>
       <w:pgMar w:bottom="1440" w:footer="720" w:gutter="0" w:header="720" w:left="1440" w:right="1440" w:top="1440"/>

</xml_diff>